<commit_message>
docs/refactor: Update GURO title to GURO: GUIDED UNIFIED RESOURCE OPTIMIZATION across system, web, mobile, and documentation
</commit_message>
<xml_diff>
--- a/docs/GURO_Proposal_Updated.docx
+++ b/docs/GURO_Proposal_Updated.docx
@@ -8652,7 +8652,7 @@
         <w:jc w:val="both"/>
       </w:pPr>
       <w:r>
-        <w:t xml:space="preserve">The scope of this project is on the design and development of the Guided Unified Remote Online (GURO) cross-platform application, which is a rule-based adaptive tutoring system targeting Grade 4–6 elementary students in Mathematics and English. The system encompasses three client layers: (1) an offline-first React Native mobile application for student-facing learning, assessment, and progress tracking; (2) a React + Vite web portal providing teacher analytics, classroom management, lesson ingestion, and parent monitoring dashboards; and (3) a Laravel 11 REST API backend with a MySQL relational database that handles authentication, classroom management, AI-powered content generation via Google Gemini 2.5 Flash, item bank storage, and progress telemetry synchronization. The application supports adaptive tutoring, outcome-driven assessments, predictive performance analysis, and randomized content delivery. Implementation includes a client-side rule-based adaptive engine, an AI-assisted server-side content generation pipeline, a classroom invite-code pairing system, offline-first SQLite local storage with background sync, a gamification layer (XP points, virtual stars, streak counters, collectible badges, and a mascot outfit shop), and a parental control module. System evaluation will include structured system testing, UAT with Grade 4–6 teachers and students, and performance benchmarking on low-cost Android devices. [1, 4, 6]</w:t>
+        <w:t xml:space="preserve">The scope of this project is on the design and development of the GURO: GUIDED UNIFIED RESOURCE OPTIMIZATION cross-platform application, which is a rule-based adaptive tutoring system targeting Grade 4–6 elementary students in Mathematics and English. The system encompasses three client layers: (1) an offline-first React Native mobile application for student-facing learning, assessment, and progress tracking; (2) a React + Vite web portal providing teacher analytics, classroom management, lesson ingestion, and parent monitoring dashboards; and (3) a Laravel 11 REST API backend with a MySQL relational database that handles authentication, classroom management, AI-powered content generation via Google Gemini 2.5 Flash, item bank storage, and progress telemetry synchronization. The application supports adaptive tutoring, outcome-driven assessments, predictive performance analysis, and randomized content delivery. Implementation includes a client-side rule-based adaptive engine, an AI-assisted server-side content generation pipeline, a classroom invite-code pairing system, offline-first SQLite local storage with background sync, a gamification layer (XP points, virtual stars, streak counters, collectible badges, and a mascot outfit shop), and a parental control module. System evaluation will include structured system testing, UAT with Grade 4–6 teachers and students, and performance benchmarking on low-cost Android devices. [1, 4, 6]</w:t>
       </w:r>
     </w:p>
     <w:p>
@@ -10885,7 +10885,7 @@
         <w:jc w:val="both"/>
       </w:pPr>
       <w:r>
-        <w:t xml:space="preserve">This chapter presents the review of related literature and studies that provided the theoretical, educational and technological basis of developing the proposed cross-platform application GURO: Guided Unified Remote Online – A Rule-Based Adaptive Tutoring Cross-Platform Application for Mathematics and English with Outcome-Driven Assessment, Predictive Performance Analysis and Randomized Content Delivery for Grade 4-6 Elementary Students in Remote Areas. This will be done by critically analyzing scholarly works, pertinent educational theories, learning technologies and existing applications relevant to the current challenges in elementary learning. Review of previous studies, and related online applications will build the logical justification and conceptual basis for the proposed application. </w:t>
+        <w:t xml:space="preserve">This chapter presents the review of related literature and studies that provided the theoretical, educational and technological basis of developing the proposed cross-platform application GURO: GUIDED UNIFIED RESOURCE OPTIMIZATION – A Rule-Based Adaptive Tutoring Cross-Platform Application for Mathematics and English with Outcome-Driven Assessment, Predictive Performance Analysis and Randomized Content Delivery for Grade 4-6 Elementary Students in Remote Areas. This will be done by critically analyzing scholarly works, pertinent educational theories, learning technologies and existing applications relevant to the current challenges in elementary learning. Review of previous studies, and related online applications will build the logical justification and conceptual basis for the proposed application. </w:t>
       </w:r>
     </w:p>
     <w:p>
@@ -15947,6 +15947,29 @@
     <w:p>
       <w:pPr>
         <w:spacing w:after="200"/>
+        <w:jc w:val="both"/>
+        <w:rPr>
+          <w:b w:val="0"/>
+          <w:bCs w:val="0"/>
+          <w:sz w:val="22"/>
+          <w:szCs w:val="22"/>
+        </w:rPr>
+      </w:pPr>
+      <w:r>
+        <w:rPr>
+          <w:b/>
+          <w:bCs/>
+          <w:i/>
+          <w:iCs/>
+          <w:sz w:val="22"/>
+          <w:szCs w:val="22"/>
+        </w:rPr>
+        <w:t>Backend Platform — Firebase (Authentication, Firestore, Cloud Functions, Cloud Storage)</w:t>
+      </w:r>
+    </w:p>
+    <w:p>
+      <w:pPr>
+        <w:spacing w:after="200"/>
         <w:ind w:firstLine="720" w:firstLineChars="0"/>
         <w:jc w:val="both"/>
         <w:rPr>
@@ -16674,7 +16697,13 @@
         </w:rPr>
       </w:pPr>
       <w:r>
-        <w:t xml:space="preserve">Their proposed directions have also been informed by adviser and panel consultations done during the capsule proposal and proposal defense in which the system was steered towards a cross-platform software- The student's interface will be a React Native application while the teacher's and administrator's interface will be a React.js/Vite PWA supported by an offlineto-online, queue-based synchronization dashboard using the Laravel REST API backend. </w:t>
+        <w:rPr>
+          <w:i w:val="0"/>
+          <w:iCs w:val="0"/>
+          <w:sz w:val="22"/>
+          <w:szCs w:val="22"/>
+        </w:rPr>
+        <w:t xml:space="preserve">Their proposed directions have also been informed by adviser and panel consultations done during the capsule proposal and proposal defense in which the system was steered towards a cross-platform software- The student's interface will be a React Native application while the teacher's and administrator's interface will be a React.js/Vite PWA supported by an offlineto-online, queue-based synchronization dashboard using a Firebase backend. </w:t>
       </w:r>
     </w:p>
     <w:p>
@@ -17194,7 +17223,33 @@
         </w:rPr>
       </w:pPr>
       <w:r>
-        <w:t xml:space="preserve">Application Layer includes the on-device rule-based adaptive tutoring engine, similar in nature to rule-based and constraint-based student modeling techniques detailed in intelligent tutoring research [2], [3], which allows for item selection, difficulty routing and scoring that is not dependent on connectivity and functions without a live connection. This layer also include the offline-to-online queue synching Manager, to batch submitted quizzes and progress updates until network connectivity is detected, and a set of a Laravel GeminiService API pipeline to process lessons upon ingest, facilitate content approval workflows, and aggregate divisional predictions.</w:t>
+        <w:rPr>
+          <w:rFonts w:hint="default"/>
+          <w:b/>
+          <w:bCs/>
+          <w:sz w:val="22"/>
+          <w:szCs w:val="22"/>
+        </w:rPr>
+        <w:t>Application Layer</w:t>
+      </w:r>
+      <w:r>
+        <w:rPr>
+          <w:rFonts w:hint="default"/>
+          <w:b/>
+          <w:bCs/>
+          <w:sz w:val="22"/>
+          <w:szCs w:val="22"/>
+          <w:lang w:val="en-PH"/>
+        </w:rPr>
+        <w:t xml:space="preserve"> </w:t>
+      </w:r>
+      <w:r>
+        <w:rPr>
+          <w:rFonts w:hint="default"/>
+          <w:sz w:val="22"/>
+          <w:szCs w:val="22"/>
+        </w:rPr>
+        <w:t>includes the on-device rule-based adaptive tutoring engine, similar in nature to rule-based and constraint-based student modeling techniques detailed in intelligent tutoring research [2], [3], which allows for item selection, difficulty routing and scoring that is not dependent on connectivity and functions without a live connection. This layer also include the offline-to-online queue synching Manager, to batch submitted quizzes and progress updates until network connectivity is detected, and a set of Firebase Cloud functions to process lessons upon ingest, facilitate content approval workflows, and aggregate divisional predictions.</w:t>
       </w:r>
     </w:p>
     <w:p>
@@ -19566,7 +19621,22 @@
         <w:jc w:val="both"/>
       </w:pPr>
       <w:r>
-        <w:t xml:space="preserve">Classroom Join and Authentication — students join a classroom using a six-character code, with offline-queued join requests that resolve automatically once connectivity returns; teachers and admins authenticate through Laravel Sanctum bearer-token authentication with role-based access control.</w:t>
+        <w:rPr>
+          <w:rFonts w:ascii="Times New Roman" w:hAnsi="Times New Roman" w:eastAsia="Times New Roman" w:cs="Times New Roman"/>
+          <w:b/>
+          <w:bCs/>
+          <w:sz w:val="22"/>
+          <w:szCs w:val="22"/>
+        </w:rPr>
+        <w:t xml:space="preserve">Classroom Join and Authentication — </w:t>
+      </w:r>
+      <w:r>
+        <w:rPr>
+          <w:rFonts w:ascii="Times New Roman" w:hAnsi="Times New Roman" w:eastAsia="Times New Roman" w:cs="Times New Roman"/>
+          <w:sz w:val="22"/>
+          <w:szCs w:val="22"/>
+        </w:rPr>
+        <w:t>students join a classroom using a six-character code, with offline-queued join requests that resolve automatically once connectivity returns; teachers and admins authenticate through Firebase Authentication with role-based access.</w:t>
       </w:r>
     </w:p>
     <w:p>
@@ -20926,7 +20996,18 @@
         </w:rPr>
       </w:pPr>
       <w:r>
-        <w:t xml:space="preserve">Assumptions include that each participating teacher and division office is capable of accessing internet at least intermittently and frequently enough to execute lesson ingestion, content approval, and periodic sync between devices, even without connectivity from students. This aligns with prior reports on pervasive connectivity deficits among public schools in the geographically isolated and deprived communities of the Philippines [10]. The team presumes that the Laravel 11 backend server and MySQL database will remain operational and accessible during the pilot deployment period at the division level as such and that our devices support a standard modern JavaScript environment with the ability to install PWA’s that are able to install using service workers, and that the necessary SDK’s for development (the Expo managed platform, and Laravel/Sanctum PHP dependencies).</w:t>
+        <w:rPr>
+          <w:rFonts w:ascii="Times New Roman" w:hAnsi="Times New Roman" w:eastAsia="Times New Roman" w:cs="Times New Roman"/>
+          <w:color w:val="000000" w:themeColor="text1"/>
+          <w:sz w:val="22"/>
+          <w:szCs w:val="22"/>
+          <w14:textFill>
+            <w14:solidFill>
+              <w14:schemeClr w14:val="tx1"/>
+            </w14:solidFill>
+          </w14:textFill>
+        </w:rPr>
+        <w:t>Assumptions include that each participating teacher and division office is capable of accessing internet at least intermittently and frequently enough to execute lesson ingestion, content approval, and periodic sync between devices, even without connectivity from students. This aligns with prior reports on pervasive connectivity deficits among public schools in the geographically isolated and deprived communities of the Philippines [10]. The team presumes that Firebase will continue to be available at a scale sufficient to support pilot deployment at the division level as such and that our devices support a standard modern JavaScript environment with the ability to install PWA’s that are able to install using service workers, and that the necessary SDK’s for development (the Expo managed platform, and Firebase JavaScript/React Native clients).</w:t>
       </w:r>
     </w:p>
     <w:p>
@@ -21981,7 +22062,22 @@
         <w:jc w:val="both"/>
       </w:pPr>
       <w:r>
-        <w:t xml:space="preserve">API Testing — Postman was used to test the GURO Laravel REST API endpoints during the development of the lesson ingestion pipeline pipeline.</w:t>
+        <w:rPr>
+          <w:rFonts w:ascii="Times New Roman" w:hAnsi="Times New Roman" w:eastAsia="Times New Roman" w:cs="Times New Roman"/>
+          <w:b/>
+          <w:bCs/>
+          <w:sz w:val="22"/>
+          <w:szCs w:val="22"/>
+        </w:rPr>
+        <w:t xml:space="preserve">API Testing — </w:t>
+      </w:r>
+      <w:r>
+        <w:rPr>
+          <w:rFonts w:ascii="Times New Roman" w:hAnsi="Times New Roman" w:eastAsia="Times New Roman" w:cs="Times New Roman"/>
+          <w:sz w:val="22"/>
+          <w:szCs w:val="22"/>
+        </w:rPr>
+        <w:t>Postman was used to test Firebase Cloud Function endpoints during the development of the lesson ingestion pipeline.</w:t>
       </w:r>
     </w:p>
     <w:p>

</xml_diff>